<commit_message>
Rebuild Ch09 The Second Founding worksheets: add student work + teacher answer keys
Co-Authored-By: Claude Opus 4.8 <noreply@anthropic.com>
Claude-Session: https://claude.ai/code/session_015FDXZfxhU1Z58uEGaySNHv
</commit_message>
<xml_diff>
--- a/Part-Two-Ch09-The-Second-Founding/Black Codes & Sharecropping.docx
+++ b/Part-Two-Ch09-The-Second-Founding/Black Codes & Sharecropping.docx
@@ -9,25 +9,22 @@
         <w:tblLook w:firstColumn="1" w:firstRow="1" w:lastColumn="0" w:lastRow="0" w:noHBand="0" w:noVBand="1" w:val="04A0"/>
       </w:tblPr>
       <w:tblGrid>
-        <w:gridCol w:w="9936"/>
+        <w:gridCol w:w="10224"/>
       </w:tblGrid>
       <w:tr>
         <w:tc>
           <w:tcPr>
-            <w:tcW w:type="dxa" w:w="9936"/>
+            <w:tcW w:type="dxa" w:w="10224"/>
             <w:shd w:val="clear" w:fill="B1442F"/>
           </w:tcPr>
           <w:p>
-            <w:pPr>
-              <w:jc w:val="left"/>
-            </w:pPr>
             <w:r>
               <w:rPr>
                 <w:b/>
                 <w:color w:val="FFE6DE"/>
                 <w:sz w:val="18"/>
               </w:rPr>
-              <w:t>CHAPTER 9 · DEEP DIVE · A HOUSE DIVIDED</w:t>
+              <w:t>PROMISE &amp; PRACTICE  ·  DEEP DIVE  ·  SOURCE ANALYSIS</w:t>
             </w:r>
           </w:p>
           <w:p>
@@ -35,18 +32,19 @@
               <w:rPr>
                 <w:b/>
                 <w:color w:val="FFFFFF"/>
-                <w:sz w:val="40"/>
+                <w:sz w:val="42"/>
               </w:rPr>
-              <w:t>Black Codes &amp; Sharecropping</w:t>
+              <w:t>Black Codes &amp; Sharecropping — A House Divided</w:t>
             </w:r>
           </w:p>
           <w:p>
             <w:r>
               <w:rPr>
+                <w:i/>
                 <w:color w:val="FFE6DE"/>
-                <w:sz w:val="21"/>
+                <w:sz w:val="22"/>
               </w:rPr>
-              <w:t>How the old order fought to rebuild slavery in all but name — through law, and through debt. 1865–1877.</w:t>
+              <w:t>Free on Paper, Bound in Practice</w:t>
             </w:r>
           </w:p>
         </w:tc>
@@ -64,7 +62,7 @@
         <w:rPr>
           <w:sz w:val="21"/>
         </w:rPr>
-        <w:t xml:space="preserve">__________________________    </w:t>
+        <w:t xml:space="preserve">______________________________    </w:t>
       </w:r>
       <w:r>
         <w:rPr>
@@ -90,30 +88,177 @@
         <w:rPr>
           <w:sz w:val="21"/>
         </w:rPr>
-        <w:t>______________</w:t>
+        <w:t>________________</w:t>
+      </w:r>
+    </w:p>
+    <w:tbl>
+      <w:tblPr>
+        <w:tblW w:type="auto" w:w="0"/>
+        <w:tblLayout w:type="autofit"/>
+        <w:tblLook w:firstColumn="1" w:firstRow="1" w:lastColumn="0" w:lastRow="0" w:noHBand="0" w:noVBand="1" w:val="04A0"/>
+      </w:tblPr>
+      <w:tblGrid>
+        <w:gridCol w:w="10224"/>
+      </w:tblGrid>
+      <w:tr>
+        <w:tc>
+          <w:tcPr>
+            <w:tcW w:type="dxa" w:w="10224"/>
+            <w:shd w:val="clear" w:fill="f4c04e"/>
+          </w:tcPr>
+          <w:p>
+            <w:r>
+              <w:rPr>
+                <w:b/>
+                <w:color w:val="5A4512"/>
+                <w:sz w:val="19"/>
+              </w:rPr>
+              <w:t xml:space="preserve">WHAT I CAN DO TODAY   </w:t>
+            </w:r>
+            <w:r>
+              <w:rPr>
+                <w:color w:val="5A4512"/>
+                <w:sz w:val="21"/>
+              </w:rPr>
+              <w:t>I can read primary sources about Black Codes &amp; Sharecropping — A House Divided, weigh who made each one and why, and use evidence to answer historical questions.</w:t>
+            </w:r>
+          </w:p>
+        </w:tc>
+      </w:tr>
+    </w:tbl>
+    <w:p>
+      <w:r>
+        <w:rPr>
+          <w:b/>
+          <w:color w:val="B1442F"/>
+        </w:rPr>
+        <w:t xml:space="preserve">Directions. </w:t>
+      </w:r>
+      <w:r>
+        <w:rPr>
+          <w:sz w:val="22"/>
+        </w:rPr>
+        <w:t>Some things changed; some things stayed the same. Sorting which is the heart of this skill</w:t>
       </w:r>
     </w:p>
     <w:p/>
     <w:p>
       <w:r>
         <w:rPr>
+          <w:b/>
+          <w:color w:val="B1442F"/>
+          <w:sz w:val="26"/>
+        </w:rPr>
+        <w:t>THE SOURCES</w:t>
+      </w:r>
+    </w:p>
+    <w:p>
+      <w:pPr>
+        <w:spacing w:before="160"/>
+      </w:pPr>
+      <w:r>
+        <w:rPr>
+          <w:b/>
+          <w:color w:val="1C1714"/>
+          <w:sz w:val="23"/>
+        </w:rPr>
+        <w:t>THE IMAGE · 1862  —  A freedpeople family, 1862</w:t>
+      </w:r>
+    </w:p>
+    <w:p>
+      <w:pPr>
+        <w:jc w:val="center"/>
+      </w:pPr>
+      <w:r>
+        <w:drawing>
+          <wp:inline xmlns:a="http://schemas.openxmlformats.org/drawingml/2006/main" xmlns:pic="http://schemas.openxmlformats.org/drawingml/2006/picture">
+            <wp:extent cx="3931920" cy="4847320"/>
+            <wp:docPr id="1" name="Picture 1"/>
+            <wp:cNvGraphicFramePr>
+              <a:graphicFrameLocks noChangeAspect="1"/>
+            </wp:cNvGraphicFramePr>
+            <a:graphic>
+              <a:graphicData uri="http://schemas.openxmlformats.org/drawingml/2006/picture">
+                <pic:pic>
+                  <pic:nvPicPr>
+                    <pic:cNvPr id="0" name="image.jpg"/>
+                    <pic:cNvPicPr/>
+                  </pic:nvPicPr>
+                  <pic:blipFill>
+                    <a:blip r:embed="rId9"/>
+                    <a:stretch>
+                      <a:fillRect/>
+                    </a:stretch>
+                  </pic:blipFill>
+                  <pic:spPr>
+                    <a:xfrm>
+                      <a:off x="0" y="0"/>
+                      <a:ext cx="3931920" cy="4847320"/>
+                    </a:xfrm>
+                    <a:prstGeom prst="rect"/>
+                  </pic:spPr>
+                </pic:pic>
+              </a:graphicData>
+            </a:graphic>
+          </wp:inline>
+        </w:drawing>
+      </w:r>
+    </w:p>
+    <w:p>
+      <w:r>
+        <w:rPr>
+          <w:color w:val="6A6256"/>
+          <w:sz w:val="17"/>
+        </w:rPr>
+        <w:t>A family born into slavery on Smith’s Plantation, Beaufort, South Carolina — photograph by Timothy H. O’Sullivan, 1862, public domain (Library of Congress).</w:t>
+      </w:r>
+    </w:p>
+    <w:p>
+      <w:pPr>
+        <w:spacing w:before="160"/>
+      </w:pPr>
+      <w:r>
+        <w:rPr>
+          <w:b/>
+          <w:color w:val="1C1714"/>
+          <w:sz w:val="23"/>
+        </w:rPr>
+        <w:t>SOURCE · HOW SHARECROPPING WORKED  —  The debt cycle</w:t>
+      </w:r>
+    </w:p>
+    <w:p>
+      <w:pPr>
+        <w:ind w:left="432"/>
+      </w:pPr>
+      <w:r>
+        <w:rPr>
           <w:i/>
           <w:color w:val="1C1714"/>
           <w:sz w:val="22"/>
         </w:rPr>
-        <w:t>How the old order fought to rebuild slavery in all but name — through law, and through debt. 1865–1877.</w:t>
+        <w:t>A sharecropper farmed a landowner's land for a share of the crop. He borrowed — at high interest — for seed, tools, and food against the coming harvest. At settlement, the landowner's accounts often showed the cropper still owed money. The law then required him to keep working to pay the debt. The next year began the same way.</w:t>
+        <w:br/>
+        <w:t>— summarized from the historical record. Public domain</w:t>
       </w:r>
     </w:p>
     <w:p>
-      <w:pPr>
-        <w:spacing w:after="80"/>
-      </w:pPr>
       <w:r>
         <w:rPr>
-          <w:color w:val="1C1714"/>
-          <w:sz w:val="23"/>
+          <w:color w:val="6A6256"/>
+          <w:sz w:val="17"/>
         </w:rPr>
-        <w:t>If people are legally ‘free’ but cannot leave, cannot choose their work, and can never get out of debt, how free are they really?</w:t>
+        <w:t>— summarized from the historical record. Public domain.</w:t>
+      </w:r>
+    </w:p>
+    <w:p/>
+    <w:p>
+      <w:r>
+        <w:rPr>
+          <w:b/>
+          <w:color w:val="B1442F"/>
+          <w:sz w:val="26"/>
+        </w:rPr>
+        <w:t>YOUR WORK</w:t>
       </w:r>
     </w:p>
     <w:p>
@@ -123,44 +268,65 @@
       <w:r>
         <w:rPr>
           <w:b/>
-          <w:color w:val="B1442F"/>
-          <w:sz w:val="28"/>
+          <w:color w:val="FFFFFF"/>
+          <w:sz w:val="20"/>
+          <w:shd w:val="clear" w:fill="B1442F"/>
         </w:rPr>
-        <w:t>The Black Codes</w:t>
+        <w:t xml:space="preserve">  QUESTION 1  </w:t>
+      </w:r>
+      <w:r>
+        <w:rPr>
+          <w:b/>
+          <w:color w:val="6A6256"/>
+          <w:sz w:val="18"/>
+        </w:rPr>
+        <w:t xml:space="preserve">   STEP 1 · THE BLACK CODES</w:t>
       </w:r>
     </w:p>
     <w:p>
       <w:r>
         <w:rPr>
-          <w:b/>
-          <w:color w:val="6A6256"/>
-          <w:sz w:val="17"/>
+          <w:b w:val="0"/>
+          <w:color w:val="1C1714"/>
+          <w:sz w:val="23"/>
         </w:rPr>
-        <w:t>1865–66</w:t>
+        <w:t>Give two specific examples of how the Black Codes restricted the freedom of formerly enslaved people.</w:t>
       </w:r>
     </w:p>
     <w:p>
       <w:pPr>
-        <w:spacing w:after="80"/>
+        <w:spacing w:after="120"/>
       </w:pPr>
       <w:r>
         <w:rPr>
-          <w:color w:val="1C1714"/>
-          <w:sz w:val="23"/>
+          <w:color w:val="9A9286"/>
+          <w:sz w:val="22"/>
         </w:rPr>
-        <w:t>As soon as the war ended, Southern state governments under Johnson's lenient plan passed the Black Codes — laws designed to control freedpeople and force them back to work for white landowners.</w:t>
+        <w:t>____________________________________________________________________________________________</w:t>
       </w:r>
     </w:p>
     <w:p>
       <w:pPr>
-        <w:spacing w:after="80"/>
+        <w:spacing w:after="120"/>
       </w:pPr>
       <w:r>
         <w:rPr>
-          <w:color w:val="1C1714"/>
-          <w:sz w:val="23"/>
+          <w:color w:val="9A9286"/>
+          <w:sz w:val="22"/>
         </w:rPr>
-        <w:t>Under vagrancy laws, a Black person without a labor contract could be arrested and hired out. The codes restricted where freedpeople could live, what jobs they could hold, and whether they could own guns or testify in court. It was freedom in name, bondage in practice.</w:t>
+        <w:t>____________________________________________________________________________________________</w:t>
+      </w:r>
+    </w:p>
+    <w:p>
+      <w:pPr>
+        <w:spacing w:after="120"/>
+      </w:pPr>
+      <w:r>
+        <w:rPr>
+          <w:color w:val="9A9286"/>
+          <w:sz w:val="22"/>
+        </w:rPr>
+        <w:t>____________________________________________________________________________________________</w:t>
       </w:r>
     </w:p>
     <w:p>
@@ -170,40 +336,77 @@
       <w:r>
         <w:rPr>
           <w:b/>
-          <w:color w:val="B1442F"/>
-          <w:sz w:val="28"/>
+          <w:color w:val="FFFFFF"/>
+          <w:sz w:val="20"/>
+          <w:shd w:val="clear" w:fill="B1442F"/>
         </w:rPr>
-        <w:t>“Slavery Is Dead?”</w:t>
+        <w:t xml:space="preserve">  QUESTION 2  </w:t>
+      </w:r>
+      <w:r>
+        <w:rPr>
+          <w:b/>
+          <w:color w:val="6A6256"/>
+          <w:sz w:val="18"/>
+        </w:rPr>
+        <w:t xml:space="preserve">   STEP 2 · THE TRAP</w:t>
       </w:r>
     </w:p>
     <w:p>
       <w:r>
         <w:rPr>
-          <w:b/>
-          <w:color w:val="6A6256"/>
-          <w:sz w:val="17"/>
+          <w:b w:val="0"/>
+          <w:color w:val="1C1714"/>
+          <w:sz w:val="23"/>
         </w:rPr>
-        <w:t>THOMAS NAST, 1867</w:t>
+        <w:t>Why did sharecropping so often trap families in poverty, year after year?</w:t>
       </w:r>
     </w:p>
     <w:p>
+      <w:pPr>
+        <w:spacing w:after="40"/>
+        <w:ind w:left="432"/>
+      </w:pPr>
       <w:r>
         <w:rPr>
-          <w:i/>
-          <w:color w:val="1C1714"/>
           <w:sz w:val="22"/>
         </w:rPr>
-        <w:t>Nast's bitter cartoon asks whether slavery is truly dead when a Black man can still be whipped and sold into forced labor under a new set of laws. The question mark is the whole point.</w:t>
+        <w:t>☐  A.  they had to borrow at high interest and the debt rarely got paid off</w:t>
       </w:r>
     </w:p>
     <w:p>
+      <w:pPr>
+        <w:spacing w:after="40"/>
+        <w:ind w:left="432"/>
+      </w:pPr>
       <w:r>
         <w:rPr>
-          <w:i/>
-          <w:color w:val="6A6256"/>
-          <w:sz w:val="17"/>
+          <w:sz w:val="22"/>
         </w:rPr>
-        <w:t>“Slavery Is Dead?” — wood engraving by Thomas Nast, Harper's Weekly, 1867, public domain (Library of Congress).</w:t>
+        <w:t>☐  B.  they refused to work</w:t>
+      </w:r>
+    </w:p>
+    <w:p>
+      <w:pPr>
+        <w:spacing w:after="40"/>
+        <w:ind w:left="432"/>
+      </w:pPr>
+      <w:r>
+        <w:rPr>
+          <w:sz w:val="22"/>
+        </w:rPr>
+        <w:t>☐  C.  crops always failed</w:t>
+      </w:r>
+    </w:p>
+    <w:p>
+      <w:pPr>
+        <w:spacing w:after="40"/>
+        <w:ind w:left="432"/>
+      </w:pPr>
+      <w:r>
+        <w:rPr>
+          <w:sz w:val="22"/>
+        </w:rPr>
+        <w:t>☐  D.  they owned too much land</w:t>
       </w:r>
     </w:p>
     <w:p>
@@ -213,54 +416,65 @@
       <w:r>
         <w:rPr>
           <w:b/>
-          <w:color w:val="B1442F"/>
-          <w:sz w:val="28"/>
+          <w:color w:val="FFFFFF"/>
+          <w:sz w:val="20"/>
+          <w:shd w:val="clear" w:fill="B1442F"/>
         </w:rPr>
-        <w:t>Sharecropping</w:t>
+        <w:t xml:space="preserve">  QUESTION 3  </w:t>
+      </w:r>
+      <w:r>
+        <w:rPr>
+          <w:b/>
+          <w:color w:val="6A6256"/>
+          <w:sz w:val="18"/>
+        </w:rPr>
+        <w:t xml:space="preserve">   STEP 3 · CHANGE VS. CONTINUITY</w:t>
       </w:r>
     </w:p>
     <w:p>
       <w:r>
         <w:rPr>
-          <w:b/>
-          <w:color w:val="6A6256"/>
-          <w:sz w:val="17"/>
+          <w:b w:val="0"/>
+          <w:color w:val="1C1714"/>
+          <w:sz w:val="23"/>
         </w:rPr>
-        <w:t>THE TRAP OF DEBT</w:t>
+        <w:t>Compared with slavery, name one real thing that changed for freedpeople, and one important thing that stayed the same.</w:t>
       </w:r>
     </w:p>
     <w:p>
       <w:pPr>
-        <w:spacing w:after="80"/>
+        <w:spacing w:after="120"/>
       </w:pPr>
       <w:r>
         <w:rPr>
-          <w:color w:val="1C1714"/>
-          <w:sz w:val="23"/>
+          <w:color w:val="9A9286"/>
+          <w:sz w:val="22"/>
         </w:rPr>
-        <w:t>Congress struck down the worst Black Codes — but the economic trap remained. With no land of their own, most freedpeople became sharecroppers: they farmed a landowner's land in exchange for a share of the crop.</w:t>
+        <w:t>____________________________________________________________________________________________</w:t>
       </w:r>
     </w:p>
     <w:p>
       <w:pPr>
-        <w:spacing w:after="80"/>
+        <w:spacing w:after="120"/>
       </w:pPr>
       <w:r>
         <w:rPr>
-          <w:color w:val="1C1714"/>
-          <w:sz w:val="23"/>
+          <w:color w:val="9A9286"/>
+          <w:sz w:val="22"/>
         </w:rPr>
-        <w:t>It sounded fair. In practice, it was a cycle of debt. Sharecroppers had to borrow against the future crop for seed, tools, and food at inflated prices. When the harvest came, they often owed more than they earned — and the law bound them to keep working until the debt was paid. The debt almost never ended.</w:t>
+        <w:t>____________________________________________________________________________________________</w:t>
       </w:r>
     </w:p>
     <w:p>
+      <w:pPr>
+        <w:spacing w:after="120"/>
+      </w:pPr>
       <w:r>
         <w:rPr>
-          <w:i/>
-          <w:color w:val="6A6256"/>
-          <w:sz w:val="17"/>
+          <w:color w:val="9A9286"/>
+          <w:sz w:val="22"/>
         </w:rPr>
-        <w:t>The five military districts, 1867 — map, © ShadowDog Digital Studios (SDS Digital Collection).</w:t>
+        <w:t>____________________________________________________________________________________________</w:t>
       </w:r>
     </w:p>
     <w:p>
@@ -270,80 +484,91 @@
       <w:r>
         <w:rPr>
           <w:b/>
-          <w:color w:val="B1442F"/>
-          <w:sz w:val="28"/>
+          <w:color w:val="FFFFFF"/>
+          <w:sz w:val="20"/>
+          <w:shd w:val="clear" w:fill="B1442F"/>
         </w:rPr>
-        <w:t>Continuity and Change</w:t>
+        <w:t xml:space="preserve">  QUESTION 4  </w:t>
+      </w:r>
+      <w:r>
+        <w:rPr>
+          <w:b/>
+          <w:color w:val="6A6256"/>
+          <w:sz w:val="18"/>
+        </w:rPr>
+        <w:t xml:space="preserve">   STEP 4 · HOW FREE?</w:t>
       </w:r>
     </w:p>
     <w:p>
       <w:r>
         <w:rPr>
-          <w:b/>
-          <w:color w:val="6A6256"/>
-          <w:sz w:val="17"/>
+          <w:b w:val="0"/>
+          <w:color w:val="1C1714"/>
+          <w:sz w:val="23"/>
         </w:rPr>
-        <w:t>WHY IT MATTERS</w:t>
+        <w:t>This 1862 photograph shows a family in the first days of freedom. In three or four sentences, use the evidence to explain how the Black Codes threatened the freedom these people had just won — how much had really changed?</w:t>
       </w:r>
     </w:p>
     <w:p>
       <w:pPr>
-        <w:spacing w:after="80"/>
+        <w:spacing w:after="120"/>
       </w:pPr>
       <w:r>
         <w:rPr>
-          <w:color w:val="1C1714"/>
-          <w:sz w:val="23"/>
+          <w:color w:val="9A9286"/>
+          <w:sz w:val="22"/>
         </w:rPr>
-        <w:t>This is a story of continuity and change. What changed was real: slavery was legally gone, families could not be sold apart, and freedpeople had new rights on paper.</w:t>
+        <w:t>____________________________________________________________________________________________</w:t>
       </w:r>
     </w:p>
     <w:p>
       <w:pPr>
-        <w:spacing w:after="80"/>
+        <w:spacing w:after="120"/>
       </w:pPr>
       <w:r>
         <w:rPr>
-          <w:color w:val="1C1714"/>
-          <w:sz w:val="23"/>
+          <w:color w:val="9A9286"/>
+          <w:sz w:val="22"/>
         </w:rPr>
-        <w:t>But what continued was also powerful: the same people still controlled the land, the labor, and the law — and found new ways to keep Black Southerners poor and dependent. Freedom had arrived, but economic justice had not.</w:t>
+        <w:t>____________________________________________________________________________________________</w:t>
       </w:r>
     </w:p>
     <w:p>
       <w:pPr>
-        <w:spacing w:before="200"/>
+        <w:spacing w:after="120"/>
       </w:pPr>
       <w:r>
         <w:rPr>
-          <w:b/>
-          <w:color w:val="B1442F"/>
-          <w:sz w:val="28"/>
+          <w:color w:val="9A9286"/>
+          <w:sz w:val="22"/>
         </w:rPr>
-        <w:t>What Changed, What Stayed</w:t>
+        <w:t>____________________________________________________________________________________________</w:t>
       </w:r>
     </w:p>
     <w:p>
+      <w:pPr>
+        <w:spacing w:after="120"/>
+      </w:pPr>
       <w:r>
         <w:rPr>
-          <w:b/>
-          <w:color w:val="6A6256"/>
-          <w:sz w:val="17"/>
+          <w:color w:val="9A9286"/>
+          <w:sz w:val="22"/>
         </w:rPr>
-        <w:t>YOUR TURN</w:t>
+        <w:t>____________________________________________________________________________________________</w:t>
       </w:r>
     </w:p>
     <w:p>
+      <w:pPr>
+        <w:spacing w:after="120"/>
+      </w:pPr>
       <w:r>
         <w:rPr>
-          <w:i/>
-          <w:color w:val="1C1714"/>
+          <w:color w:val="9A9286"/>
           <w:sz w:val="22"/>
         </w:rPr>
-        <w:t>You'll compare slavery, the Black Codes, and sharecropping, and practice continuity and change — judging how much freedom really changed daily life.</w:t>
+        <w:t>____________________________________________________________________________________________</w:t>
       </w:r>
     </w:p>
-    <w:p/>
     <w:p>
       <w:pPr>
         <w:jc w:val="center"/>
@@ -356,9 +581,160 @@
         <w:t>Promise &amp; Practice · ShadowDog Digital Studios · Unit 2</w:t>
       </w:r>
     </w:p>
+    <w:p>
+      <w:r>
+        <w:br w:type="page"/>
+      </w:r>
+    </w:p>
+    <w:tbl>
+      <w:tblPr>
+        <w:tblW w:type="auto" w:w="0"/>
+        <w:tblLayout w:type="autofit"/>
+        <w:tblLook w:firstColumn="1" w:firstRow="1" w:lastColumn="0" w:lastRow="0" w:noHBand="0" w:noVBand="1" w:val="04A0"/>
+      </w:tblPr>
+      <w:tblGrid>
+        <w:gridCol w:w="10224"/>
+      </w:tblGrid>
+      <w:tr>
+        <w:tc>
+          <w:tcPr>
+            <w:tcW w:type="dxa" w:w="10224"/>
+            <w:shd w:val="clear" w:fill="2c2219"/>
+          </w:tcPr>
+          <w:p>
+            <w:r>
+              <w:rPr>
+                <w:b/>
+                <w:color w:val="F0A184"/>
+                <w:sz w:val="28"/>
+              </w:rPr>
+              <w:t>TEACHER ANSWER KEY  —  Black Codes &amp; Sharecropping — A House Divided</w:t>
+            </w:r>
+          </w:p>
+        </w:tc>
+      </w:tr>
+    </w:tbl>
+    <w:p/>
+    <w:p>
+      <w:r>
+        <w:rPr>
+          <w:b/>
+          <w:color w:val="B1442F"/>
+          <w:sz w:val="22"/>
+        </w:rPr>
+        <w:t xml:space="preserve">QUESTION 1:  </w:t>
+      </w:r>
+      <w:r>
+        <w:rPr>
+          <w:sz w:val="22"/>
+        </w:rPr>
+        <w:t>Open response.</w:t>
+      </w:r>
+    </w:p>
+    <w:p>
+      <w:pPr>
+        <w:ind w:left="432"/>
+      </w:pPr>
+      <w:r>
+        <w:rPr>
+          <w:i/>
+          <w:color w:val="6A6256"/>
+          <w:sz w:val="21"/>
+        </w:rPr>
+        <w:t>Look for a response along the lines of: “1)… 2)…”</w:t>
+      </w:r>
+    </w:p>
+    <w:p>
+      <w:r>
+        <w:rPr>
+          <w:b/>
+          <w:color w:val="B1442F"/>
+          <w:sz w:val="22"/>
+        </w:rPr>
+        <w:t xml:space="preserve">QUESTION 2:  </w:t>
+      </w:r>
+      <w:r>
+        <w:rPr>
+          <w:b/>
+          <w:sz w:val="22"/>
+        </w:rPr>
+        <w:t>Correct — A. they had to borrow at high interest and the debt rarely got paid off</w:t>
+      </w:r>
+    </w:p>
+    <w:p>
+      <w:pPr>
+        <w:ind w:left="432"/>
+      </w:pPr>
+      <w:r>
+        <w:rPr>
+          <w:i/>
+          <w:color w:val="6A6256"/>
+          <w:sz w:val="21"/>
+        </w:rPr>
+        <w:t>Right. Croppers had to borrow at high interest against the crop, and the landowner kept the accounts — so they often ended up owing more than they earned and were legally bound to keep working.</w:t>
+      </w:r>
+    </w:p>
+    <w:p>
+      <w:r>
+        <w:rPr>
+          <w:b/>
+          <w:color w:val="B1442F"/>
+          <w:sz w:val="22"/>
+        </w:rPr>
+        <w:t xml:space="preserve">QUESTION 3:  </w:t>
+      </w:r>
+      <w:r>
+        <w:rPr>
+          <w:sz w:val="22"/>
+        </w:rPr>
+        <w:t>Open response.</w:t>
+      </w:r>
+    </w:p>
+    <w:p>
+      <w:pPr>
+        <w:ind w:left="432"/>
+      </w:pPr>
+      <w:r>
+        <w:rPr>
+          <w:i/>
+          <w:color w:val="6A6256"/>
+          <w:sz w:val="21"/>
+        </w:rPr>
+        <w:t>Look for a response along the lines of: “Changed:… | Stayed the same:…”</w:t>
+      </w:r>
+    </w:p>
+    <w:p>
+      <w:r>
+        <w:rPr>
+          <w:b/>
+          <w:color w:val="B1442F"/>
+          <w:sz w:val="22"/>
+        </w:rPr>
+        <w:t xml:space="preserve">QUESTION 4:  </w:t>
+      </w:r>
+      <w:r>
+        <w:rPr>
+          <w:sz w:val="22"/>
+        </w:rPr>
+        <w:t>Open response.</w:t>
+      </w:r>
+    </w:p>
+    <w:p>
+      <w:pPr>
+        <w:ind w:left="432"/>
+      </w:pPr>
+      <w:r>
+        <w:rPr>
+          <w:i/>
+          <w:color w:val="6A6256"/>
+          <w:sz w:val="21"/>
+        </w:rPr>
+        <w:t>Look for a response along the lines of: “Slavery was legally dead, but…”</w:t>
+      </w:r>
+    </w:p>
     <w:sectPr>
       <w:pgSz w:w="12240" w:h="15840"/>
-      <w:pgMar w:top="1152" w:right="1152" w:bottom="1152" w:left="1152" w:header="720" w:footer="720" w:gutter="0"/>
+      <w:pgMar w:top="1008" w:right="1008" w:bottom="1008" w:left="1008" w:header="720" w:footer="720" w:gutter="0"/>
       <w:cols w:space="720"/>
       <w:docGrid w:linePitch="360"/>
     </w:sectPr>

</xml_diff>